<commit_message>
Add skill requirements to vacancies; revise Chapter I and survey docs
- Add req_skills field to job_vacancies (migration, parse, REQ_COLS)
- Layer 2 matching now checks skill overlap between vacancy and jobseeker profile
- req_summary() shows required skills chip; req_warnings() flags zero-overlap
- Vacancy form (_vacancy_requirements.html) renders skills checkboxes from SKILLS_LIST
- Chapter I background, objectives, significance, scope fully rewritten to match actual system
- Survey TAM questionnaire and link updated

Co-Authored-By: Claude Sonnet 4.6 <noreply@anthropic.com>
</commit_message>
<xml_diff>
--- a/DOCUMENTATION/SURVEY/UPDATED/TAM_Questionnaire_PESO.docx
+++ b/DOCUMENTATION/SURVEY/UPDATED/TAM_Questionnaire_PESO.docx
@@ -30,7 +30,40 @@
     </w:p>
     <w:p>
       <w:r>
-        <w:t>Respondent Profile:  Age: ________   Sex: ________   Role (Jobseeker / Employer / PESO staff / General user): ________   Frequency of Use: ________</w:t>
+        <w:t xml:space="preserve">Respondent Profile:  </w:t>
+      </w:r>
+    </w:p>
+    <w:p>
+      <w:r>
+        <w:t>Name: _________________________________</w:t>
+      </w:r>
+    </w:p>
+    <w:p>
+      <w:r>
+        <w:t xml:space="preserve">Age: ________   </w:t>
+      </w:r>
+    </w:p>
+    <w:p>
+      <w:r>
+        <w:t xml:space="preserve">Sex: ________   </w:t>
+      </w:r>
+    </w:p>
+    <w:p>
+      <w:r>
+        <w:t>Role (Jobseeker / Employer / PESO staff / General user</w:t>
+      </w:r>
+      <w:proofErr w:type="gramStart"/>
+      <w:r>
+        <w:t>): _</w:t>
+      </w:r>
+      <w:proofErr w:type="gramEnd"/>
+      <w:r>
+        <w:t xml:space="preserve">_______   </w:t>
+      </w:r>
+    </w:p>
+    <w:p>
+      <w:r>
+        <w:t>Frequency of Use: ________</w:t>
       </w:r>
     </w:p>
     <w:p>
@@ -989,7 +1022,11 @@
           </w:tcPr>
           <w:p>
             <w:r>
-              <w:t>The system's interface (buttons, menus, navigation) is user-friendly.</w:t>
+              <w:t>The system's interface (buttons, menus, navigation) is user-</w:t>
+            </w:r>
+            <w:r>
+              <w:lastRenderedPageBreak/>
+              <w:t>friendly.</w:t>
             </w:r>
           </w:p>
         </w:tc>
@@ -1330,7 +1367,6 @@
               <w:jc w:val="center"/>
             </w:pPr>
             <w:r>
-              <w:lastRenderedPageBreak/>
               <w:t>BI4</w:t>
             </w:r>
           </w:p>

</xml_diff>